<commit_message>
Add first-class CPU and CUDA campaign launch paths
</commit_message>
<xml_diff>
--- a/Software Validation from Datasets/Evaluation Tool/docs/automated_evaluation/Word Documents/3_machine_a_readiness.docx
+++ b/Software Validation from Datasets/Evaluation Tool/docs/automated_evaluation/Word Documents/3_machine_a_readiness.docx
@@ -5,26 +5,17 @@
     <w:p>
       <w:pPr>
         <w:pStyle w:val="Title"/>
-        <w:pBdr>
-          <w:bottom w:val="single" w:sz="8" w:color="1F4E79" w:space="4"/>
-        </w:pBdr>
       </w:pPr>
       <w:r>
-        <w:t>Machine A readiness</w:t>
+        <w:t>Machine A CPU and CUDA readiness</w:t>
       </w:r>
     </w:p>
     <w:p>
+      <w:pPr>
+        <w:pStyle w:val="Subtitle"/>
+      </w:pPr>
       <w:r>
-        <w:t xml:space="preserve">Verdict: </w:t>
-      </w:r>
-      <w:r>
-        <w:rPr>
-          <w:b/>
-        </w:rPr>
-        <w:t>`NOT_READY_TO_LAUNCH`</w:t>
-      </w:r>
-      <w:r>
-        <w:t>. The complete assignment was inspected, not sampled. All 20 assigned scenarios passed scenario-specific data, model, RIR, pipeline, bounds, and executor-support checks, but assignment-wide launch approval is blocked by the dirty candidate source tree and missing FFmpeg.</w:t>
+        <w:t>Operational contract • generated from version-controlled Markdown</w:t>
       </w:r>
     </w:p>
     <w:p>
@@ -32,7 +23,749 @@
         <w:pStyle w:val="Heading2"/>
       </w:pPr>
       <w:r>
-        <w:t>Measured profile</w:t>
+        <w:t>Verdict</w:t>
+      </w:r>
+    </w:p>
+    <w:p>
+      <w:r>
+        <w:t>Both implementations are qualified; separate final clean-clone preflights are required. Global massive launch is not authorized.</w:t>
+      </w:r>
+    </w:p>
+    <w:p>
+      <w:r>
+        <w:t>The preserved CPU path uses .venv, PyTorch 2.11.0+cpu, core-cpu, cpu, and float32. The CUDA path uses an isolated environment and the evidence below. Each campaign assigns Machine A 20 scenarios, 12,368 item executions, 2,750 unique source files, and 16.882998 repeated audio hours. The authoritative launch verdict for each mode must come from its post-commit clean clone.</w:t>
+      </w:r>
+    </w:p>
+    <w:p>
+      <w:pPr>
+        <w:pStyle w:val="Heading2"/>
+      </w:pPr>
+      <w:r>
+        <w:t>Hardware and runtime evidence</w:t>
+      </w:r>
+    </w:p>
+    <w:tbl>
+      <w:tblPr>
+        <w:tblStyle w:val="TableGrid"/>
+        <w:tblW w:type="auto" w:w="0"/>
+        <w:jc w:val="center"/>
+        <w:tblLook w:firstColumn="1" w:firstRow="1" w:lastColumn="0" w:lastRow="0" w:noHBand="0" w:noVBand="1" w:val="04A0"/>
+      </w:tblPr>
+      <w:tblGrid>
+        <w:gridCol w:w="5285"/>
+        <w:gridCol w:w="5285"/>
+      </w:tblGrid>
+      <w:tr>
+        <w:trPr>
+          <w:tblHeader w:val="true"/>
+        </w:trPr>
+        <w:tc>
+          <w:tcPr>
+            <w:tcW w:type="dxa" w:w="5285"/>
+            <w:vAlign w:val="center"/>
+            <w:tcMar>
+              <w:top w:w="65" w:type="dxa"/>
+              <w:start w:w="65" w:type="dxa"/>
+              <w:bottom w:w="65" w:type="dxa"/>
+              <w:end w:w="65" w:type="dxa"/>
+            </w:tcMar>
+            <w:shd w:fill="2F5597"/>
+          </w:tcPr>
+          <w:p>
+            <w:pPr>
+              <w:spacing w:after="0"/>
+            </w:pPr>
+            <w:r>
+              <w:rPr>
+                <w:b/>
+                <w:color w:val="FFFFFF"/>
+                <w:sz w:val="14"/>
+              </w:rPr>
+              <w:t>Field</w:t>
+            </w:r>
+          </w:p>
+        </w:tc>
+        <w:tc>
+          <w:tcPr>
+            <w:tcW w:type="dxa" w:w="5285"/>
+            <w:vAlign w:val="center"/>
+            <w:tcMar>
+              <w:top w:w="65" w:type="dxa"/>
+              <w:start w:w="65" w:type="dxa"/>
+              <w:bottom w:w="65" w:type="dxa"/>
+              <w:end w:w="65" w:type="dxa"/>
+            </w:tcMar>
+            <w:shd w:fill="2F5597"/>
+          </w:tcPr>
+          <w:p>
+            <w:pPr>
+              <w:spacing w:after="0"/>
+            </w:pPr>
+            <w:r>
+              <w:rPr>
+                <w:b/>
+                <w:color w:val="FFFFFF"/>
+                <w:sz w:val="14"/>
+              </w:rPr>
+              <w:t>Value</w:t>
+            </w:r>
+          </w:p>
+        </w:tc>
+      </w:tr>
+      <w:tr>
+        <w:tc>
+          <w:tcPr>
+            <w:tcW w:type="dxa" w:w="5285"/>
+            <w:vAlign w:val="center"/>
+            <w:tcMar>
+              <w:top w:w="65" w:type="dxa"/>
+              <w:start w:w="65" w:type="dxa"/>
+              <w:bottom w:w="65" w:type="dxa"/>
+              <w:end w:w="65" w:type="dxa"/>
+            </w:tcMar>
+          </w:tcPr>
+          <w:p>
+            <w:pPr>
+              <w:spacing w:after="0"/>
+            </w:pPr>
+            <w:r>
+              <w:rPr>
+                <w:sz w:val="14"/>
+              </w:rPr>
+              <w:t>OS</w:t>
+            </w:r>
+          </w:p>
+        </w:tc>
+        <w:tc>
+          <w:tcPr>
+            <w:tcW w:type="dxa" w:w="5285"/>
+            <w:vAlign w:val="center"/>
+            <w:tcMar>
+              <w:top w:w="65" w:type="dxa"/>
+              <w:start w:w="65" w:type="dxa"/>
+              <w:bottom w:w="65" w:type="dxa"/>
+              <w:end w:w="65" w:type="dxa"/>
+            </w:tcMar>
+          </w:tcPr>
+          <w:p>
+            <w:pPr>
+              <w:spacing w:after="0"/>
+            </w:pPr>
+            <w:r>
+              <w:rPr>
+                <w:sz w:val="14"/>
+              </w:rPr>
+              <w:t>Windows 11 (10.0.26200)</w:t>
+            </w:r>
+          </w:p>
+        </w:tc>
+      </w:tr>
+      <w:tr>
+        <w:tc>
+          <w:tcPr>
+            <w:tcW w:type="dxa" w:w="5285"/>
+            <w:vAlign w:val="center"/>
+            <w:tcMar>
+              <w:top w:w="65" w:type="dxa"/>
+              <w:start w:w="65" w:type="dxa"/>
+              <w:bottom w:w="65" w:type="dxa"/>
+              <w:end w:w="65" w:type="dxa"/>
+            </w:tcMar>
+          </w:tcPr>
+          <w:p>
+            <w:pPr>
+              <w:spacing w:after="0"/>
+            </w:pPr>
+            <w:r>
+              <w:rPr>
+                <w:sz w:val="14"/>
+              </w:rPr>
+              <w:t>CPU</w:t>
+            </w:r>
+          </w:p>
+        </w:tc>
+        <w:tc>
+          <w:tcPr>
+            <w:tcW w:type="dxa" w:w="5285"/>
+            <w:vAlign w:val="center"/>
+            <w:tcMar>
+              <w:top w:w="65" w:type="dxa"/>
+              <w:start w:w="65" w:type="dxa"/>
+              <w:bottom w:w="65" w:type="dxa"/>
+              <w:end w:w="65" w:type="dxa"/>
+            </w:tcMar>
+          </w:tcPr>
+          <w:p>
+            <w:pPr>
+              <w:spacing w:after="0"/>
+            </w:pPr>
+            <w:r>
+              <w:rPr>
+                <w:sz w:val="14"/>
+              </w:rPr>
+              <w:t>8 physical / 16 logical cores</w:t>
+            </w:r>
+          </w:p>
+        </w:tc>
+      </w:tr>
+      <w:tr>
+        <w:tc>
+          <w:tcPr>
+            <w:tcW w:type="dxa" w:w="5285"/>
+            <w:vAlign w:val="center"/>
+            <w:tcMar>
+              <w:top w:w="65" w:type="dxa"/>
+              <w:start w:w="65" w:type="dxa"/>
+              <w:bottom w:w="65" w:type="dxa"/>
+              <w:end w:w="65" w:type="dxa"/>
+            </w:tcMar>
+          </w:tcPr>
+          <w:p>
+            <w:pPr>
+              <w:spacing w:after="0"/>
+            </w:pPr>
+            <w:r>
+              <w:rPr>
+                <w:sz w:val="14"/>
+              </w:rPr>
+              <w:t>RAM</w:t>
+            </w:r>
+          </w:p>
+        </w:tc>
+        <w:tc>
+          <w:tcPr>
+            <w:tcW w:type="dxa" w:w="5285"/>
+            <w:vAlign w:val="center"/>
+            <w:tcMar>
+              <w:top w:w="65" w:type="dxa"/>
+              <w:start w:w="65" w:type="dxa"/>
+              <w:bottom w:w="65" w:type="dxa"/>
+              <w:end w:w="65" w:type="dxa"/>
+            </w:tcMar>
+          </w:tcPr>
+          <w:p>
+            <w:pPr>
+              <w:spacing w:after="0"/>
+            </w:pPr>
+            <w:r>
+              <w:rPr>
+                <w:sz w:val="14"/>
+              </w:rPr>
+              <w:t>about 64 GiB</w:t>
+            </w:r>
+          </w:p>
+        </w:tc>
+      </w:tr>
+      <w:tr>
+        <w:tc>
+          <w:tcPr>
+            <w:tcW w:type="dxa" w:w="5285"/>
+            <w:vAlign w:val="center"/>
+            <w:tcMar>
+              <w:top w:w="65" w:type="dxa"/>
+              <w:start w:w="65" w:type="dxa"/>
+              <w:bottom w:w="65" w:type="dxa"/>
+              <w:end w:w="65" w:type="dxa"/>
+            </w:tcMar>
+          </w:tcPr>
+          <w:p>
+            <w:pPr>
+              <w:spacing w:after="0"/>
+            </w:pPr>
+            <w:r>
+              <w:rPr>
+                <w:sz w:val="14"/>
+              </w:rPr>
+              <w:t>GPU</w:t>
+            </w:r>
+          </w:p>
+        </w:tc>
+        <w:tc>
+          <w:tcPr>
+            <w:tcW w:type="dxa" w:w="5285"/>
+            <w:vAlign w:val="center"/>
+            <w:tcMar>
+              <w:top w:w="65" w:type="dxa"/>
+              <w:start w:w="65" w:type="dxa"/>
+              <w:bottom w:w="65" w:type="dxa"/>
+              <w:end w:w="65" w:type="dxa"/>
+            </w:tcMar>
+          </w:tcPr>
+          <w:p>
+            <w:pPr>
+              <w:spacing w:after="0"/>
+            </w:pPr>
+            <w:r>
+              <w:rPr>
+                <w:sz w:val="14"/>
+              </w:rPr>
+              <w:t>NVIDIA GeForce RTX 3080</w:t>
+            </w:r>
+          </w:p>
+        </w:tc>
+      </w:tr>
+      <w:tr>
+        <w:tc>
+          <w:tcPr>
+            <w:tcW w:type="dxa" w:w="5285"/>
+            <w:vAlign w:val="center"/>
+            <w:tcMar>
+              <w:top w:w="65" w:type="dxa"/>
+              <w:start w:w="65" w:type="dxa"/>
+              <w:bottom w:w="65" w:type="dxa"/>
+              <w:end w:w="65" w:type="dxa"/>
+            </w:tcMar>
+          </w:tcPr>
+          <w:p>
+            <w:pPr>
+              <w:spacing w:after="0"/>
+            </w:pPr>
+            <w:r>
+              <w:rPr>
+                <w:sz w:val="14"/>
+              </w:rPr>
+              <w:t>VRAM</w:t>
+            </w:r>
+          </w:p>
+        </w:tc>
+        <w:tc>
+          <w:tcPr>
+            <w:tcW w:type="dxa" w:w="5285"/>
+            <w:vAlign w:val="center"/>
+            <w:tcMar>
+              <w:top w:w="65" w:type="dxa"/>
+              <w:start w:w="65" w:type="dxa"/>
+              <w:bottom w:w="65" w:type="dxa"/>
+              <w:end w:w="65" w:type="dxa"/>
+            </w:tcMar>
+          </w:tcPr>
+          <w:p>
+            <w:pPr>
+              <w:spacing w:after="0"/>
+            </w:pPr>
+            <w:r>
+              <w:rPr>
+                <w:sz w:val="14"/>
+              </w:rPr>
+              <w:t>10,240 MiB</w:t>
+            </w:r>
+          </w:p>
+        </w:tc>
+      </w:tr>
+      <w:tr>
+        <w:tc>
+          <w:tcPr>
+            <w:tcW w:type="dxa" w:w="5285"/>
+            <w:vAlign w:val="center"/>
+            <w:tcMar>
+              <w:top w:w="65" w:type="dxa"/>
+              <w:start w:w="65" w:type="dxa"/>
+              <w:bottom w:w="65" w:type="dxa"/>
+              <w:end w:w="65" w:type="dxa"/>
+            </w:tcMar>
+          </w:tcPr>
+          <w:p>
+            <w:pPr>
+              <w:spacing w:after="0"/>
+            </w:pPr>
+            <w:r>
+              <w:rPr>
+                <w:sz w:val="14"/>
+              </w:rPr>
+              <w:t>Driver</w:t>
+            </w:r>
+          </w:p>
+        </w:tc>
+        <w:tc>
+          <w:tcPr>
+            <w:tcW w:type="dxa" w:w="5285"/>
+            <w:vAlign w:val="center"/>
+            <w:tcMar>
+              <w:top w:w="65" w:type="dxa"/>
+              <w:start w:w="65" w:type="dxa"/>
+              <w:bottom w:w="65" w:type="dxa"/>
+              <w:end w:w="65" w:type="dxa"/>
+            </w:tcMar>
+          </w:tcPr>
+          <w:p>
+            <w:pPr>
+              <w:spacing w:after="0"/>
+            </w:pPr>
+            <w:r>
+              <w:rPr>
+                <w:sz w:val="14"/>
+              </w:rPr>
+              <w:t>610.62</w:t>
+            </w:r>
+          </w:p>
+        </w:tc>
+      </w:tr>
+      <w:tr>
+        <w:tc>
+          <w:tcPr>
+            <w:tcW w:type="dxa" w:w="5285"/>
+            <w:vAlign w:val="center"/>
+            <w:tcMar>
+              <w:top w:w="65" w:type="dxa"/>
+              <w:start w:w="65" w:type="dxa"/>
+              <w:bottom w:w="65" w:type="dxa"/>
+              <w:end w:w="65" w:type="dxa"/>
+            </w:tcMar>
+          </w:tcPr>
+          <w:p>
+            <w:pPr>
+              <w:spacing w:after="0"/>
+            </w:pPr>
+            <w:r>
+              <w:rPr>
+                <w:sz w:val="14"/>
+              </w:rPr>
+              <w:t>Python</w:t>
+            </w:r>
+          </w:p>
+        </w:tc>
+        <w:tc>
+          <w:tcPr>
+            <w:tcW w:type="dxa" w:w="5285"/>
+            <w:vAlign w:val="center"/>
+            <w:tcMar>
+              <w:top w:w="65" w:type="dxa"/>
+              <w:start w:w="65" w:type="dxa"/>
+              <w:bottom w:w="65" w:type="dxa"/>
+              <w:end w:w="65" w:type="dxa"/>
+            </w:tcMar>
+          </w:tcPr>
+          <w:p>
+            <w:pPr>
+              <w:spacing w:after="0"/>
+            </w:pPr>
+            <w:r>
+              <w:rPr>
+                <w:sz w:val="14"/>
+              </w:rPr>
+              <w:t>3.12.7</w:t>
+            </w:r>
+          </w:p>
+        </w:tc>
+      </w:tr>
+      <w:tr>
+        <w:tc>
+          <w:tcPr>
+            <w:tcW w:type="dxa" w:w="5285"/>
+            <w:vAlign w:val="center"/>
+            <w:tcMar>
+              <w:top w:w="65" w:type="dxa"/>
+              <w:start w:w="65" w:type="dxa"/>
+              <w:bottom w:w="65" w:type="dxa"/>
+              <w:end w:w="65" w:type="dxa"/>
+            </w:tcMar>
+          </w:tcPr>
+          <w:p>
+            <w:pPr>
+              <w:spacing w:after="0"/>
+            </w:pPr>
+            <w:r>
+              <w:rPr>
+                <w:sz w:val="14"/>
+              </w:rPr>
+              <w:t>PyTorch</w:t>
+            </w:r>
+          </w:p>
+        </w:tc>
+        <w:tc>
+          <w:tcPr>
+            <w:tcW w:type="dxa" w:w="5285"/>
+            <w:vAlign w:val="center"/>
+            <w:tcMar>
+              <w:top w:w="65" w:type="dxa"/>
+              <w:start w:w="65" w:type="dxa"/>
+              <w:bottom w:w="65" w:type="dxa"/>
+              <w:end w:w="65" w:type="dxa"/>
+            </w:tcMar>
+          </w:tcPr>
+          <w:p>
+            <w:pPr>
+              <w:spacing w:after="0"/>
+            </w:pPr>
+            <w:r>
+              <w:rPr>
+                <w:sz w:val="14"/>
+              </w:rPr>
+              <w:t>2.11.0+cu128</w:t>
+            </w:r>
+          </w:p>
+        </w:tc>
+      </w:tr>
+      <w:tr>
+        <w:tc>
+          <w:tcPr>
+            <w:tcW w:type="dxa" w:w="5285"/>
+            <w:vAlign w:val="center"/>
+            <w:tcMar>
+              <w:top w:w="65" w:type="dxa"/>
+              <w:start w:w="65" w:type="dxa"/>
+              <w:bottom w:w="65" w:type="dxa"/>
+              <w:end w:w="65" w:type="dxa"/>
+            </w:tcMar>
+          </w:tcPr>
+          <w:p>
+            <w:pPr>
+              <w:spacing w:after="0"/>
+            </w:pPr>
+            <w:r>
+              <w:rPr>
+                <w:sz w:val="14"/>
+              </w:rPr>
+              <w:t>CUDA runtime / cuDNN</w:t>
+            </w:r>
+          </w:p>
+        </w:tc>
+        <w:tc>
+          <w:tcPr>
+            <w:tcW w:type="dxa" w:w="5285"/>
+            <w:vAlign w:val="center"/>
+            <w:tcMar>
+              <w:top w:w="65" w:type="dxa"/>
+              <w:start w:w="65" w:type="dxa"/>
+              <w:bottom w:w="65" w:type="dxa"/>
+              <w:end w:w="65" w:type="dxa"/>
+            </w:tcMar>
+          </w:tcPr>
+          <w:p>
+            <w:pPr>
+              <w:spacing w:after="0"/>
+            </w:pPr>
+            <w:r>
+              <w:rPr>
+                <w:sz w:val="14"/>
+              </w:rPr>
+              <w:t>12.8 / 91900</w:t>
+            </w:r>
+          </w:p>
+        </w:tc>
+      </w:tr>
+      <w:tr>
+        <w:tc>
+          <w:tcPr>
+            <w:tcW w:type="dxa" w:w="5285"/>
+            <w:vAlign w:val="center"/>
+            <w:tcMar>
+              <w:top w:w="65" w:type="dxa"/>
+              <w:start w:w="65" w:type="dxa"/>
+              <w:bottom w:w="65" w:type="dxa"/>
+              <w:end w:w="65" w:type="dxa"/>
+            </w:tcMar>
+          </w:tcPr>
+          <w:p>
+            <w:pPr>
+              <w:spacing w:after="0"/>
+            </w:pPr>
+            <w:r>
+              <w:rPr>
+                <w:sz w:val="14"/>
+              </w:rPr>
+              <w:t>Profile</w:t>
+            </w:r>
+          </w:p>
+        </w:tc>
+        <w:tc>
+          <w:tcPr>
+            <w:tcW w:type="dxa" w:w="5285"/>
+            <w:vAlign w:val="center"/>
+            <w:tcMar>
+              <w:top w:w="65" w:type="dxa"/>
+              <w:start w:w="65" w:type="dxa"/>
+              <w:bottom w:w="65" w:type="dxa"/>
+              <w:end w:w="65" w:type="dxa"/>
+            </w:tcMar>
+          </w:tcPr>
+          <w:p>
+            <w:pPr>
+              <w:spacing w:after="0"/>
+            </w:pPr>
+            <w:r>
+              <w:rPr>
+                <w:sz w:val="14"/>
+              </w:rPr>
+              <w:t>core-cuda</w:t>
+            </w:r>
+          </w:p>
+        </w:tc>
+      </w:tr>
+      <w:tr>
+        <w:tc>
+          <w:tcPr>
+            <w:tcW w:type="dxa" w:w="5285"/>
+            <w:vAlign w:val="center"/>
+            <w:tcMar>
+              <w:top w:w="65" w:type="dxa"/>
+              <w:start w:w="65" w:type="dxa"/>
+              <w:bottom w:w="65" w:type="dxa"/>
+              <w:end w:w="65" w:type="dxa"/>
+            </w:tcMar>
+          </w:tcPr>
+          <w:p>
+            <w:pPr>
+              <w:spacing w:after="0"/>
+            </w:pPr>
+            <w:r>
+              <w:rPr>
+                <w:sz w:val="14"/>
+              </w:rPr>
+              <w:t>Device / dtype</w:t>
+            </w:r>
+          </w:p>
+        </w:tc>
+        <w:tc>
+          <w:tcPr>
+            <w:tcW w:type="dxa" w:w="5285"/>
+            <w:vAlign w:val="center"/>
+            <w:tcMar>
+              <w:top w:w="65" w:type="dxa"/>
+              <w:start w:w="65" w:type="dxa"/>
+              <w:bottom w:w="65" w:type="dxa"/>
+              <w:end w:w="65" w:type="dxa"/>
+            </w:tcMar>
+          </w:tcPr>
+          <w:p>
+            <w:pPr>
+              <w:spacing w:after="0"/>
+            </w:pPr>
+            <w:r>
+              <w:rPr>
+                <w:sz w:val="14"/>
+              </w:rPr>
+              <w:t>cuda:0 / float32</w:t>
+            </w:r>
+          </w:p>
+        </w:tc>
+      </w:tr>
+      <w:tr>
+        <w:tc>
+          <w:tcPr>
+            <w:tcW w:type="dxa" w:w="5285"/>
+            <w:vAlign w:val="center"/>
+            <w:tcMar>
+              <w:top w:w="65" w:type="dxa"/>
+              <w:start w:w="65" w:type="dxa"/>
+              <w:bottom w:w="65" w:type="dxa"/>
+              <w:end w:w="65" w:type="dxa"/>
+            </w:tcMar>
+          </w:tcPr>
+          <w:p>
+            <w:pPr>
+              <w:spacing w:after="0"/>
+            </w:pPr>
+            <w:r>
+              <w:rPr>
+                <w:sz w:val="14"/>
+              </w:rPr>
+              <w:t>Whisper peak allocator VRAM</w:t>
+            </w:r>
+          </w:p>
+        </w:tc>
+        <w:tc>
+          <w:tcPr>
+            <w:tcW w:type="dxa" w:w="5285"/>
+            <w:vAlign w:val="center"/>
+            <w:tcMar>
+              <w:top w:w="65" w:type="dxa"/>
+              <w:start w:w="65" w:type="dxa"/>
+              <w:bottom w:w="65" w:type="dxa"/>
+              <w:end w:w="65" w:type="dxa"/>
+            </w:tcMar>
+          </w:tcPr>
+          <w:p>
+            <w:pPr>
+              <w:spacing w:after="0"/>
+            </w:pPr>
+            <w:r>
+              <w:rPr>
+                <w:sz w:val="14"/>
+              </w:rPr>
+              <w:t>418.89 MiB allocated; 426 MiB reserved</w:t>
+            </w:r>
+          </w:p>
+        </w:tc>
+      </w:tr>
+      <w:tr>
+        <w:tc>
+          <w:tcPr>
+            <w:tcW w:type="dxa" w:w="5285"/>
+            <w:vAlign w:val="center"/>
+            <w:tcMar>
+              <w:top w:w="65" w:type="dxa"/>
+              <w:start w:w="65" w:type="dxa"/>
+              <w:bottom w:w="65" w:type="dxa"/>
+              <w:end w:w="65" w:type="dxa"/>
+            </w:tcMar>
+          </w:tcPr>
+          <w:p>
+            <w:pPr>
+              <w:spacing w:after="0"/>
+            </w:pPr>
+            <w:r>
+              <w:rPr>
+                <w:sz w:val="14"/>
+              </w:rPr>
+              <w:t>Credentials</w:t>
+            </w:r>
+          </w:p>
+        </w:tc>
+        <w:tc>
+          <w:tcPr>
+            <w:tcW w:type="dxa" w:w="5285"/>
+            <w:vAlign w:val="center"/>
+            <w:tcMar>
+              <w:top w:w="65" w:type="dxa"/>
+              <w:start w:w="65" w:type="dxa"/>
+              <w:bottom w:w="65" w:type="dxa"/>
+              <w:end w:w="65" w:type="dxa"/>
+            </w:tcMar>
+          </w:tcPr>
+          <w:p>
+            <w:pPr>
+              <w:spacing w:after="0"/>
+            </w:pPr>
+            <w:r>
+              <w:rPr>
+                <w:sz w:val="14"/>
+              </w:rPr>
+              <w:t>None</w:t>
+            </w:r>
+          </w:p>
+        </w:tc>
+      </w:tr>
+    </w:tbl>
+    <w:p>
+      <w:r>
+        <w:t>CPU has no CUDA prerequisite and must report GPU measurements as unavailable rather than fabricating zeros. CUDA requires the exact GPU profile and fails on CPU-only PyTorch.</w:t>
+      </w:r>
+    </w:p>
+    <w:p>
+      <w:r>
+        <w:t>torch.cuda.is_available() was true, the selected device opened successfully, the model parameter device was CUDA, and real evaluator diagnostics showed nonzero allocated and reserved VRAM. See gpu_qualification_report.md.</w:t>
+      </w:r>
+    </w:p>
+    <w:p>
+      <w:pPr>
+        <w:pStyle w:val="Heading2"/>
+      </w:pPr>
+      <w:r>
+        <w:t>Capacity</w:t>
+      </w:r>
+    </w:p>
+    <w:p>
+      <w:r>
+        <w:t>Measured CUDA pipeline RTF gives a 3.40-hour point estimate and 2.81–5.18-hour range for Machine A, including 20 seconds of initialization allowance per scenario. Keep at least 7.2 GiB free. This is a bounded estimate, not a guarantee; desktop GPU activity contaminated device-wide utilization samples. Measure a separate bounded estimate before selecting the CPU campaign.</w:t>
+      </w:r>
+    </w:p>
+    <w:p>
+      <w:pPr>
+        <w:pStyle w:val="Heading2"/>
+      </w:pPr>
+      <w:r>
+        <w:t>CPU clean-clone preflight-only</w:t>
       </w:r>
     </w:p>
     <w:tbl>
@@ -41,630 +774,42 @@
         <w:jc w:val="center"/>
         <w:tblLayout w:type="autofit"/>
         <w:tblLook w:firstColumn="1" w:firstRow="1" w:lastColumn="0" w:lastRow="0" w:noHBand="0" w:noVBand="1" w:val="04A0"/>
-        <w:tblBorders>
-          <w:top w:val="single" w:sz="4" w:space="0" w:color="B7C9DA"/>
-          <w:left w:val="single" w:sz="4" w:space="0" w:color="B7C9DA"/>
-          <w:bottom w:val="single" w:sz="4" w:space="0" w:color="B7C9DA"/>
-          <w:right w:val="single" w:sz="4" w:space="0" w:color="B7C9DA"/>
-          <w:insideH w:val="single" w:sz="4" w:space="0" w:color="B7C9DA"/>
-          <w:insideV w:val="single" w:sz="4" w:space="0" w:color="B7C9DA"/>
-        </w:tblBorders>
       </w:tblPr>
       <w:tblGrid>
-        <w:gridCol w:w="5083"/>
-        <w:gridCol w:w="5083"/>
+        <w:gridCol w:w="10570"/>
       </w:tblGrid>
-      <w:tr>
-        <w:trPr>
-          <w:tblHeader w:val="true"/>
-        </w:trPr>
-        <w:tc>
-          <w:tcPr>
-            <w:tcW w:type="dxa" w:w="5083"/>
-            <w:vAlign w:val="center"/>
-            <w:tcMar>
-              <w:top w:w="70" w:type="dxa"/>
-              <w:start w:w="80" w:type="dxa"/>
-              <w:bottom w:w="70" w:type="dxa"/>
-              <w:end w:w="80" w:type="dxa"/>
-            </w:tcMar>
-            <w:shd w:fill="EAF1F8"/>
-          </w:tcPr>
-          <w:p>
-            <w:pPr>
-              <w:spacing w:after="0" w:line="240" w:lineRule="auto"/>
-            </w:pPr>
-            <w:r>
-              <w:rPr>
-                <w:b/>
-                <w:color w:val="1F4E79"/>
-                <w:sz w:val="17"/>
-              </w:rPr>
-              <w:t>Capability</w:t>
-            </w:r>
-          </w:p>
-        </w:tc>
-        <w:tc>
-          <w:tcPr>
-            <w:tcW w:type="dxa" w:w="5083"/>
-            <w:vAlign w:val="center"/>
-            <w:tcMar>
-              <w:top w:w="70" w:type="dxa"/>
-              <w:start w:w="80" w:type="dxa"/>
-              <w:bottom w:w="70" w:type="dxa"/>
-              <w:end w:w="80" w:type="dxa"/>
-            </w:tcMar>
-            <w:shd w:fill="EAF1F8"/>
-          </w:tcPr>
-          <w:p>
-            <w:pPr>
-              <w:spacing w:after="0" w:line="240" w:lineRule="auto"/>
-            </w:pPr>
-            <w:r>
-              <w:rPr>
-                <w:b/>
-                <w:color w:val="1F4E79"/>
-                <w:sz w:val="17"/>
-              </w:rPr>
-              <w:t>Observed value</w:t>
-            </w:r>
-          </w:p>
-        </w:tc>
-      </w:tr>
       <w:tr>
         <w:tc>
           <w:tcPr>
-            <w:tcW w:type="dxa" w:w="5083"/>
-            <w:vAlign w:val="center"/>
+            <w:tcW w:type="dxa" w:w="10570"/>
+            <w:shd w:fill="F2F4F7"/>
             <w:tcMar>
-              <w:top w:w="70" w:type="dxa"/>
-              <w:start w:w="80" w:type="dxa"/>
-              <w:bottom w:w="70" w:type="dxa"/>
-              <w:end w:w="80" w:type="dxa"/>
+              <w:top w:w="110" w:type="dxa"/>
+              <w:start w:w="110" w:type="dxa"/>
+              <w:bottom w:w="110" w:type="dxa"/>
+              <w:end w:w="110" w:type="dxa"/>
             </w:tcMar>
           </w:tcPr>
           <w:p>
             <w:pPr>
-              <w:spacing w:after="0" w:line="240" w:lineRule="auto"/>
-            </w:pPr>
-            <w:r>
-              <w:rPr>
-                <w:sz w:val="17"/>
-              </w:rPr>
-              <w:t>OS</w:t>
-            </w:r>
-          </w:p>
-        </w:tc>
-        <w:tc>
-          <w:tcPr>
-            <w:tcW w:type="dxa" w:w="5083"/>
-            <w:vAlign w:val="center"/>
-            <w:tcMar>
-              <w:top w:w="70" w:type="dxa"/>
-              <w:start w:w="80" w:type="dxa"/>
-              <w:bottom w:w="70" w:type="dxa"/>
-              <w:end w:w="80" w:type="dxa"/>
-            </w:tcMar>
-          </w:tcPr>
-          <w:p>
-            <w:pPr>
-              <w:spacing w:after="0" w:line="240" w:lineRule="auto"/>
-            </w:pPr>
-            <w:r>
-              <w:rPr>
-                <w:sz w:val="17"/>
-              </w:rPr>
-              <w:t>Windows 11, AMD64</w:t>
-            </w:r>
-          </w:p>
-        </w:tc>
-      </w:tr>
-      <w:tr>
-        <w:tc>
-          <w:tcPr>
-            <w:tcW w:type="dxa" w:w="5083"/>
-            <w:vAlign w:val="center"/>
-            <w:tcMar>
-              <w:top w:w="70" w:type="dxa"/>
-              <w:start w:w="80" w:type="dxa"/>
-              <w:bottom w:w="70" w:type="dxa"/>
-              <w:end w:w="80" w:type="dxa"/>
-            </w:tcMar>
-          </w:tcPr>
-          <w:p>
-            <w:pPr>
-              <w:spacing w:after="0" w:line="240" w:lineRule="auto"/>
-            </w:pPr>
-            <w:r>
-              <w:rPr>
-                <w:sz w:val="17"/>
-              </w:rPr>
-              <w:t>CPU</w:t>
-            </w:r>
-          </w:p>
-        </w:tc>
-        <w:tc>
-          <w:tcPr>
-            <w:tcW w:type="dxa" w:w="5083"/>
-            <w:vAlign w:val="center"/>
-            <w:tcMar>
-              <w:top w:w="70" w:type="dxa"/>
-              <w:start w:w="80" w:type="dxa"/>
-              <w:bottom w:w="70" w:type="dxa"/>
-              <w:end w:w="80" w:type="dxa"/>
-            </w:tcMar>
-          </w:tcPr>
-          <w:p>
-            <w:pPr>
-              <w:spacing w:after="0" w:line="240" w:lineRule="auto"/>
-            </w:pPr>
-            <w:r>
-              <w:rPr>
-                <w:sz w:val="17"/>
-              </w:rPr>
-              <w:t>AMD64 Family 25 Model 33; 8 physical / 16 logical cores</w:t>
-            </w:r>
-          </w:p>
-        </w:tc>
-      </w:tr>
-      <w:tr>
-        <w:tc>
-          <w:tcPr>
-            <w:tcW w:type="dxa" w:w="5083"/>
-            <w:vAlign w:val="center"/>
-            <w:tcMar>
-              <w:top w:w="70" w:type="dxa"/>
-              <w:start w:w="80" w:type="dxa"/>
-              <w:bottom w:w="70" w:type="dxa"/>
-              <w:end w:w="80" w:type="dxa"/>
-            </w:tcMar>
-          </w:tcPr>
-          <w:p>
-            <w:pPr>
-              <w:spacing w:after="0" w:line="240" w:lineRule="auto"/>
-            </w:pPr>
-            <w:r>
-              <w:rPr>
-                <w:sz w:val="17"/>
-              </w:rPr>
-              <w:t>RAM</w:t>
-            </w:r>
-          </w:p>
-        </w:tc>
-        <w:tc>
-          <w:tcPr>
-            <w:tcW w:type="dxa" w:w="5083"/>
-            <w:vAlign w:val="center"/>
-            <w:tcMar>
-              <w:top w:w="70" w:type="dxa"/>
-              <w:start w:w="80" w:type="dxa"/>
-              <w:bottom w:w="70" w:type="dxa"/>
-              <w:end w:w="80" w:type="dxa"/>
-            </w:tcMar>
-          </w:tcPr>
-          <w:p>
-            <w:pPr>
-              <w:spacing w:after="0" w:line="240" w:lineRule="auto"/>
-            </w:pPr>
-            <w:r>
-              <w:rPr>
-                <w:sz w:val="17"/>
-              </w:rPr>
-              <w:t>68,641,923,072 bytes (about 63.9 GiB)</w:t>
-            </w:r>
-          </w:p>
-        </w:tc>
-      </w:tr>
-      <w:tr>
-        <w:tc>
-          <w:tcPr>
-            <w:tcW w:type="dxa" w:w="5083"/>
-            <w:vAlign w:val="center"/>
-            <w:tcMar>
-              <w:top w:w="70" w:type="dxa"/>
-              <w:start w:w="80" w:type="dxa"/>
-              <w:bottom w:w="70" w:type="dxa"/>
-              <w:end w:w="80" w:type="dxa"/>
-            </w:tcMar>
-          </w:tcPr>
-          <w:p>
-            <w:pPr>
-              <w:spacing w:after="0" w:line="240" w:lineRule="auto"/>
-            </w:pPr>
-            <w:r>
-              <w:rPr>
-                <w:sz w:val="17"/>
-              </w:rPr>
-              <w:t>GPU</w:t>
-            </w:r>
-          </w:p>
-        </w:tc>
-        <w:tc>
-          <w:tcPr>
-            <w:tcW w:type="dxa" w:w="5083"/>
-            <w:vAlign w:val="center"/>
-            <w:tcMar>
-              <w:top w:w="70" w:type="dxa"/>
-              <w:start w:w="80" w:type="dxa"/>
-              <w:bottom w:w="70" w:type="dxa"/>
-              <w:end w:w="80" w:type="dxa"/>
-            </w:tcMar>
-          </w:tcPr>
-          <w:p>
-            <w:pPr>
-              <w:spacing w:after="0" w:line="240" w:lineRule="auto"/>
-            </w:pPr>
-            <w:r>
-              <w:rPr>
-                <w:sz w:val="17"/>
-              </w:rPr>
-              <w:t>NVIDIA GeForce RTX 3080, 10,240 MiB; driver 610.62</w:t>
-            </w:r>
-          </w:p>
-        </w:tc>
-      </w:tr>
-      <w:tr>
-        <w:tc>
-          <w:tcPr>
-            <w:tcW w:type="dxa" w:w="5083"/>
-            <w:vAlign w:val="center"/>
-            <w:tcMar>
-              <w:top w:w="70" w:type="dxa"/>
-              <w:start w:w="80" w:type="dxa"/>
-              <w:bottom w:w="70" w:type="dxa"/>
-              <w:end w:w="80" w:type="dxa"/>
-            </w:tcMar>
-          </w:tcPr>
-          <w:p>
-            <w:pPr>
-              <w:spacing w:after="0" w:line="240" w:lineRule="auto"/>
-            </w:pPr>
-            <w:r>
-              <w:rPr>
-                <w:sz w:val="17"/>
-              </w:rPr>
-              <w:t>Active launch environment</w:t>
-            </w:r>
-          </w:p>
-        </w:tc>
-        <w:tc>
-          <w:tcPr>
-            <w:tcW w:type="dxa" w:w="5083"/>
-            <w:vAlign w:val="center"/>
-            <w:tcMar>
-              <w:top w:w="70" w:type="dxa"/>
-              <w:start w:w="80" w:type="dxa"/>
-              <w:bottom w:w="70" w:type="dxa"/>
-              <w:end w:w="80" w:type="dxa"/>
-            </w:tcMar>
-          </w:tcPr>
-          <w:p>
-            <w:pPr>
-              <w:spacing w:after="0" w:line="240" w:lineRule="auto"/>
-            </w:pPr>
-            <w:r>
-              <w:rPr>
-                <w:sz w:val="17"/>
-              </w:rPr>
-              <w:t xml:space="preserve">Python 3.12.7; PyTorch 2.11.0+cpu; </w:t>
-            </w:r>
-            <w:r>
-              <w:rPr>
-                <w:rFonts w:ascii="Consolas" w:hAnsi="Consolas"/>
-                <w:color w:val="1F2937"/>
-                <w:sz w:val="17"/>
-              </w:rPr>
-              <w:t>core-cpu</w:t>
-            </w:r>
-          </w:p>
-        </w:tc>
-      </w:tr>
-      <w:tr>
-        <w:tc>
-          <w:tcPr>
-            <w:tcW w:type="dxa" w:w="5083"/>
-            <w:vAlign w:val="center"/>
-            <w:tcMar>
-              <w:top w:w="70" w:type="dxa"/>
-              <w:start w:w="80" w:type="dxa"/>
-              <w:bottom w:w="70" w:type="dxa"/>
-              <w:end w:w="80" w:type="dxa"/>
-            </w:tcMar>
-          </w:tcPr>
-          <w:p>
-            <w:pPr>
-              <w:spacing w:after="0" w:line="240" w:lineRule="auto"/>
-            </w:pPr>
-            <w:r>
-              <w:rPr>
-                <w:sz w:val="17"/>
-              </w:rPr>
-              <w:t>CUDA in active interpreter</w:t>
-            </w:r>
-          </w:p>
-        </w:tc>
-        <w:tc>
-          <w:tcPr>
-            <w:tcW w:type="dxa" w:w="5083"/>
-            <w:vAlign w:val="center"/>
-            <w:tcMar>
-              <w:top w:w="70" w:type="dxa"/>
-              <w:start w:w="80" w:type="dxa"/>
-              <w:bottom w:w="70" w:type="dxa"/>
-              <w:end w:w="80" w:type="dxa"/>
-            </w:tcMar>
-          </w:tcPr>
-          <w:p>
-            <w:pPr>
-              <w:spacing w:after="0" w:line="240" w:lineRule="auto"/>
-            </w:pPr>
-            <w:r>
-              <w:rPr>
-                <w:sz w:val="17"/>
-              </w:rPr>
-              <w:t>Unavailable by design; the candidate is CPU/float32</w:t>
-            </w:r>
-          </w:p>
-        </w:tc>
-      </w:tr>
-      <w:tr>
-        <w:tc>
-          <w:tcPr>
-            <w:tcW w:type="dxa" w:w="5083"/>
-            <w:vAlign w:val="center"/>
-            <w:tcMar>
-              <w:top w:w="70" w:type="dxa"/>
-              <w:start w:w="80" w:type="dxa"/>
-              <w:bottom w:w="70" w:type="dxa"/>
-              <w:end w:w="80" w:type="dxa"/>
-            </w:tcMar>
-          </w:tcPr>
-          <w:p>
-            <w:pPr>
-              <w:spacing w:after="0" w:line="240" w:lineRule="auto"/>
-            </w:pPr>
-            <w:r>
-              <w:rPr>
-                <w:sz w:val="17"/>
-              </w:rPr>
-              <w:t>FFmpeg</w:t>
-            </w:r>
-          </w:p>
-        </w:tc>
-        <w:tc>
-          <w:tcPr>
-            <w:tcW w:type="dxa" w:w="5083"/>
-            <w:vAlign w:val="center"/>
-            <w:tcMar>
-              <w:top w:w="70" w:type="dxa"/>
-              <w:start w:w="80" w:type="dxa"/>
-              <w:bottom w:w="70" w:type="dxa"/>
-              <w:end w:w="80" w:type="dxa"/>
-            </w:tcMar>
-          </w:tcPr>
-          <w:p>
-            <w:pPr>
-              <w:spacing w:after="0" w:line="240" w:lineRule="auto"/>
-            </w:pPr>
-            <w:r>
-              <w:rPr>
-                <w:sz w:val="17"/>
-              </w:rPr>
-              <w:t xml:space="preserve">Missing from </w:t>
-            </w:r>
-            <w:r>
-              <w:rPr>
-                <w:rFonts w:ascii="Consolas" w:hAnsi="Consolas"/>
-                <w:color w:val="1F2937"/>
-                <w:sz w:val="17"/>
-              </w:rPr>
-              <w:t>PATH</w:t>
-            </w:r>
-            <w:r>
-              <w:rPr>
-                <w:sz w:val="17"/>
-              </w:rPr>
-              <w:t xml:space="preserve"> — blocker</w:t>
-            </w:r>
-          </w:p>
-        </w:tc>
-      </w:tr>
-      <w:tr>
-        <w:tc>
-          <w:tcPr>
-            <w:tcW w:type="dxa" w:w="5083"/>
-            <w:vAlign w:val="center"/>
-            <w:tcMar>
-              <w:top w:w="70" w:type="dxa"/>
-              <w:start w:w="80" w:type="dxa"/>
-              <w:bottom w:w="70" w:type="dxa"/>
-              <w:end w:w="80" w:type="dxa"/>
-            </w:tcMar>
-          </w:tcPr>
-          <w:p>
-            <w:pPr>
-              <w:spacing w:after="0" w:line="240" w:lineRule="auto"/>
-            </w:pPr>
-            <w:r>
-              <w:rPr>
-                <w:sz w:val="17"/>
-              </w:rPr>
-              <w:t>Campaign disk at final capture</w:t>
-            </w:r>
-          </w:p>
-        </w:tc>
-        <w:tc>
-          <w:tcPr>
-            <w:tcW w:type="dxa" w:w="5083"/>
-            <w:vAlign w:val="center"/>
-            <w:tcMar>
-              <w:top w:w="70" w:type="dxa"/>
-              <w:start w:w="80" w:type="dxa"/>
-              <w:bottom w:w="70" w:type="dxa"/>
-              <w:end w:w="80" w:type="dxa"/>
-            </w:tcMar>
-          </w:tcPr>
-          <w:p>
-            <w:pPr>
-              <w:spacing w:after="0" w:line="240" w:lineRule="auto"/>
-            </w:pPr>
-            <w:r>
-              <w:rPr>
-                <w:sz w:val="17"/>
-              </w:rPr>
-              <w:t>391.47 GiB free; required preflight minimum about 7.15 GiB</w:t>
-            </w:r>
-          </w:p>
-        </w:tc>
-      </w:tr>
-      <w:tr>
-        <w:tc>
-          <w:tcPr>
-            <w:tcW w:type="dxa" w:w="5083"/>
-            <w:vAlign w:val="center"/>
-            <w:tcMar>
-              <w:top w:w="70" w:type="dxa"/>
-              <w:start w:w="80" w:type="dxa"/>
-              <w:bottom w:w="70" w:type="dxa"/>
-              <w:end w:w="80" w:type="dxa"/>
-            </w:tcMar>
-          </w:tcPr>
-          <w:p>
-            <w:pPr>
-              <w:spacing w:after="0" w:line="240" w:lineRule="auto"/>
-            </w:pPr>
-            <w:r>
-              <w:rPr>
-                <w:sz w:val="17"/>
-              </w:rPr>
-              <w:t>Required model</w:t>
-            </w:r>
-          </w:p>
-        </w:tc>
-        <w:tc>
-          <w:tcPr>
-            <w:tcW w:type="dxa" w:w="5083"/>
-            <w:vAlign w:val="center"/>
-            <w:tcMar>
-              <w:top w:w="70" w:type="dxa"/>
-              <w:start w:w="80" w:type="dxa"/>
-              <w:bottom w:w="70" w:type="dxa"/>
-              <w:end w:w="80" w:type="dxa"/>
-            </w:tcMar>
-          </w:tcPr>
-          <w:p>
-            <w:pPr>
-              <w:spacing w:after="0" w:line="240" w:lineRule="auto"/>
-            </w:pPr>
-            <w:r>
-              <w:rPr>
-                <w:sz w:val="17"/>
-              </w:rPr>
-              <w:t>Whisper Base exact size/hash present</w:t>
-            </w:r>
-          </w:p>
-        </w:tc>
-      </w:tr>
-      <w:tr>
-        <w:tc>
-          <w:tcPr>
-            <w:tcW w:type="dxa" w:w="5083"/>
-            <w:vAlign w:val="center"/>
-            <w:tcMar>
-              <w:top w:w="70" w:type="dxa"/>
-              <w:start w:w="80" w:type="dxa"/>
-              <w:bottom w:w="70" w:type="dxa"/>
-              <w:end w:w="80" w:type="dxa"/>
-            </w:tcMar>
-          </w:tcPr>
-          <w:p>
-            <w:pPr>
-              <w:spacing w:after="0" w:line="240" w:lineRule="auto"/>
-            </w:pPr>
-            <w:r>
-              <w:rPr>
-                <w:sz w:val="17"/>
-              </w:rPr>
-              <w:t>Assignment</w:t>
-            </w:r>
-          </w:p>
-        </w:tc>
-        <w:tc>
-          <w:tcPr>
-            <w:tcW w:type="dxa" w:w="5083"/>
-            <w:vAlign w:val="center"/>
-            <w:tcMar>
-              <w:top w:w="70" w:type="dxa"/>
-              <w:start w:w="80" w:type="dxa"/>
-              <w:bottom w:w="70" w:type="dxa"/>
-              <w:end w:w="80" w:type="dxa"/>
-            </w:tcMar>
-          </w:tcPr>
-          <w:p>
-            <w:pPr>
-              <w:spacing w:after="0" w:line="240" w:lineRule="auto"/>
+              <w:spacing w:after="0"/>
             </w:pPr>
             <w:r>
               <w:rPr>
                 <w:rFonts w:ascii="Consolas" w:hAnsi="Consolas"/>
-                <w:color w:val="1F2937"/>
-                <w:sz w:val="17"/>
+                <w:sz w:val="13"/>
               </w:rPr>
-              <w:t>assignment_5014479496c7</w:t>
-            </w:r>
-            <w:r>
-              <w:rPr>
-                <w:sz w:val="17"/>
-              </w:rPr>
-              <w:t>; 20 scenarios; 12,368 item executions; 16.882998 audio hours</w:t>
-            </w:r>
-          </w:p>
-        </w:tc>
-      </w:tr>
-      <w:tr>
-        <w:tc>
-          <w:tcPr>
-            <w:tcW w:type="dxa" w:w="5083"/>
-            <w:vAlign w:val="center"/>
-            <w:tcMar>
-              <w:top w:w="70" w:type="dxa"/>
-              <w:start w:w="80" w:type="dxa"/>
-              <w:bottom w:w="70" w:type="dxa"/>
-              <w:end w:w="80" w:type="dxa"/>
-            </w:tcMar>
-          </w:tcPr>
-          <w:p>
-            <w:pPr>
-              <w:spacing w:after="0" w:line="240" w:lineRule="auto"/>
-            </w:pPr>
-            <w:r>
-              <w:rPr>
-                <w:sz w:val="17"/>
-              </w:rPr>
-              <w:t>Complete input coverage</w:t>
-            </w:r>
-          </w:p>
-        </w:tc>
-        <w:tc>
-          <w:tcPr>
-            <w:tcW w:type="dxa" w:w="5083"/>
-            <w:vAlign w:val="center"/>
-            <w:tcMar>
-              <w:top w:w="70" w:type="dxa"/>
-              <w:start w:w="80" w:type="dxa"/>
-              <w:bottom w:w="70" w:type="dxa"/>
-              <w:end w:w="80" w:type="dxa"/>
-            </w:tcMar>
-          </w:tcPr>
-          <w:p>
-            <w:pPr>
-              <w:spacing w:after="0" w:line="240" w:lineRule="auto"/>
-            </w:pPr>
-            <w:r>
-              <w:rPr>
-                <w:sz w:val="17"/>
-              </w:rPr>
-              <w:t>20/20 scenarios; 2,750 unique source-audio files</w:t>
+              <w:t>[powershell]</w:t>
+              <w:br/>
+              <w:t>powershell -ExecutionPolicy Bypass -File scripts\prepare_execution_mode.ps1 -Mode cpu -InstallFFmpeg -DownloadModels</w:t>
+              <w:br/>
+              <w:t>$Eval = Join-Path (Get-Location) 'Software Validation from Datasets\Evaluation Tool'</w:t>
+              <w:br/>
+              <w:t>$Python = Join-Path (Get-Location) '.venv\Scripts\python.exe'</w:t>
+              <w:br/>
+              <w:t>&amp; $Python "$Eval\scripts\materialize_launch_campaign.py" --launch-package "$Eval\configs\automated_evaluation\launch_package.v1.yaml" --automated-runs-root "$Eval\automated_runs" --bind-current-commit</w:t>
+              <w:br/>
+              <w:t>powershell -ExecutionPolicy Bypass -File "$Eval\scripts\launch_campaign_machine_a.ps1" -PreflightOnly</w:t>
             </w:r>
           </w:p>
         </w:tc>
@@ -672,119 +817,86 @@
     </w:tbl>
     <w:p>
       <w:pPr>
-        <w:spacing w:after="20"/>
+        <w:spacing w:after="0"/>
       </w:pPr>
-    </w:p>
-    <w:p>
-      <w:r>
-        <w:t>Machine A's point estimate is 4.08 hours, with a 3.46–6.24 hour planning interval. This is a capacity estimate from the observed CPU Whisper Base rate, not a completion guarantee.</w:t>
-      </w:r>
     </w:p>
     <w:p>
       <w:pPr>
         <w:pStyle w:val="Heading2"/>
       </w:pPr>
       <w:r>
-        <w:t>Actions required</w:t>
-      </w:r>
-    </w:p>
-    <w:p>
-      <w:pPr>
-        <w:pStyle w:val="ListNumber"/>
-      </w:pPr>
-      <w:r>
-        <w:t>Install FFmpeg from the repository root:</w:t>
-      </w:r>
-    </w:p>
-    <w:p>
-      <w:pPr>
-        <w:pStyle w:val="CodeBlock"/>
-        <w:shd w:fill="F3F4F6"/>
-      </w:pPr>
-      <w:r>
-        <w:t xml:space="preserve">   powershell -ExecutionPolicy Bypass -File install.ps1 -Profile dev -Device cpu -InstallFFmpeg</w:t>
-        <w:br/>
-        <w:t xml:space="preserve">   where.exe ffmpeg</w:t>
-        <w:br/>
-        <w:t xml:space="preserve">   ffmpeg -version</w:t>
-      </w:r>
-    </w:p>
-    <w:p>
-      <w:pPr>
-        <w:pStyle w:val="ListNumber"/>
-      </w:pPr>
-      <w:r>
-        <w:t>Commit/push the reviewed Stage 14 changes once and use a clean clone at that</w:t>
+        <w:t>CUDA clean-clone preflight-only</w:t>
       </w:r>
     </w:p>
     <w:p>
       <w:r>
-        <w:t xml:space="preserve">final commit. Generate runtime assignments with </w:t>
-      </w:r>
-      <w:r>
-        <w:rPr>
-          <w:rFonts w:ascii="Consolas" w:hAnsi="Consolas"/>
-          <w:color w:val="1F2937"/>
-          <w:sz w:val="19"/>
-        </w:rPr>
-        <w:t>--bind-current-commit</w:t>
-      </w:r>
-      <w:r>
-        <w:t>; do not edit tracked package identities after the commit.</w:t>
+        <w:t>From the clean clone root after licensed-data linking:</w:t>
       </w:r>
     </w:p>
+    <w:tbl>
+      <w:tblPr>
+        <w:tblW w:type="auto" w:w="0"/>
+        <w:jc w:val="center"/>
+        <w:tblLayout w:type="autofit"/>
+        <w:tblLook w:firstColumn="1" w:firstRow="1" w:lastColumn="0" w:lastRow="0" w:noHBand="0" w:noVBand="1" w:val="04A0"/>
+      </w:tblPr>
+      <w:tblGrid>
+        <w:gridCol w:w="10570"/>
+      </w:tblGrid>
+      <w:tr>
+        <w:tc>
+          <w:tcPr>
+            <w:tcW w:type="dxa" w:w="10570"/>
+            <w:shd w:fill="F2F4F7"/>
+            <w:tcMar>
+              <w:top w:w="110" w:type="dxa"/>
+              <w:start w:w="110" w:type="dxa"/>
+              <w:bottom w:w="110" w:type="dxa"/>
+              <w:end w:w="110" w:type="dxa"/>
+            </w:tcMar>
+          </w:tcPr>
+          <w:p>
+            <w:pPr>
+              <w:spacing w:after="0"/>
+            </w:pPr>
+            <w:r>
+              <w:rPr>
+                <w:rFonts w:ascii="Consolas" w:hAnsi="Consolas"/>
+                <w:sz w:val="13"/>
+              </w:rPr>
+              <w:t>[powershell]</w:t>
+              <w:br/>
+              <w:t>$Repo = (Get-Location).Path</w:t>
+              <w:br/>
+              <w:t>powershell -ExecutionPolicy Bypass -File scripts\prepare_execution_mode.ps1 -Mode cuda -InstallFFmpeg -DownloadModels</w:t>
+              <w:br/>
+              <w:t>$Eval = Join-Path $Repo 'Software Validation from Datasets\Evaluation Tool'</w:t>
+              <w:br/>
+              <w:t>$Python = Join-Path $Repo '.stage8-envs\core-cuda\Scripts\python.exe'</w:t>
+              <w:br/>
+              <w:t>&amp; $Python "$Eval\scripts\materialize_launch_campaign.py" --launch-package "$Eval\configs\automated_evaluation\launch_package.gpu.v1.yaml" --automated-runs-root "$Eval\automated_runs" --bind-current-commit</w:t>
+              <w:br/>
+              <w:t>powershell -ExecutionPolicy Bypass -File "$Eval\scripts\launch_campaign_machine_a_gpu.ps1" -PreflightOnly</w:t>
+            </w:r>
+          </w:p>
+        </w:tc>
+      </w:tr>
+    </w:tbl>
     <w:p>
       <w:pPr>
-        <w:pStyle w:val="ListNumber"/>
+        <w:spacing w:after="0"/>
       </w:pPr>
-      <w:r>
-        <w:t>Materialize the frozen campaign and rerun the full preflight:</w:t>
-      </w:r>
-    </w:p>
-    <w:p>
-      <w:pPr>
-        <w:pStyle w:val="CodeBlock"/>
-        <w:shd w:fill="F3F4F6"/>
-      </w:pPr>
-      <w:r>
-        <w:t xml:space="preserve">   Set-Location 'Software Validation from Datasets/Evaluation Tool'</w:t>
-        <w:br/>
-        <w:t xml:space="preserve">   python scripts/materialize_launch_campaign.py --bind-current-commit</w:t>
-        <w:br/>
-        <w:t xml:space="preserve">   powershell -ExecutionPolicy Bypass -File scripts/launch_campaign_machine_a.ps1</w:t>
-      </w:r>
     </w:p>
     <w:p>
       <w:r>
-        <w:t xml:space="preserve">The final command starts inference only if every check is ready. Until the small/standard scientific gates pass, stop after the generated preflight and do not authorize the massive run. The evidence files are </w:t>
-      </w:r>
-      <w:r>
-        <w:rPr>
-          <w:rFonts w:ascii="Consolas" w:hAnsi="Consolas"/>
-          <w:color w:val="1F2937"/>
-          <w:sz w:val="19"/>
-        </w:rPr>
-        <w:t>artifacts/launch_readiness/machine_a_profile.json</w:t>
-      </w:r>
-      <w:r>
-        <w:t xml:space="preserve"> and </w:t>
-      </w:r>
-      <w:r>
-        <w:rPr>
-          <w:rFonts w:ascii="Consolas" w:hAnsi="Consolas"/>
-          <w:color w:val="1F2937"/>
-          <w:sz w:val="19"/>
-        </w:rPr>
-        <w:t>machine_a_assignment_preflight.json</w:t>
-      </w:r>
-      <w:r>
-        <w:t>.</w:t>
+        <w:t>Launch only if the final command returns zero and the report says READY_TO_LAUNCH with 20/20 scenarios and no blockers.</w:t>
       </w:r>
     </w:p>
     <w:sectPr>
-      <w:footerReference w:type="default" r:id="rId9"/>
+      <w:headerReference w:type="default" r:id="rId9"/>
+      <w:footerReference w:type="default" r:id="rId10"/>
       <w:pgSz w:w="12240" w:h="15840"/>
-      <w:pgMar w:top="979" w:right="1037" w:bottom="979" w:left="1037" w:header="720" w:footer="720" w:gutter="0"/>
+      <w:pgMar w:top="720" w:right="835" w:bottom="720" w:left="835" w:header="720" w:footer="720" w:gutter="0"/>
       <w:cols w:space="720"/>
       <w:docGrid w:linePitch="360"/>
     </w:sectPr>
@@ -799,19 +911,36 @@
       <w:pStyle w:val="Footer"/>
       <w:jc w:val="right"/>
     </w:pPr>
-    <w:r/>
     <w:r>
-      <w:rPr>
-        <w:color w:val="5D6874"/>
-        <w:sz w:val="16"/>
-      </w:rPr>
-      <w:t xml:space="preserve">machine_a_readiness.md   •   </w:t>
+      <w:t xml:space="preserve">Canonical source: machine_a_readiness.md    </w:t>
+    </w:r>
+    <w:r>
+      <w:t xml:space="preserve">Page </w:t>
+    </w:r>
+    <w:r>
       <w:fldChar w:fldCharType="begin"/>
-      <w:instrText xml:space="preserve"> PAGE </w:instrText>
+      <w:instrText xml:space="preserve">PAGE</w:instrText>
       <w:fldChar w:fldCharType="end"/>
     </w:r>
   </w:p>
 </w:ftr>
+</file>
+
+<file path=word/header1.xml><?xml version="1.0" encoding="utf-8"?>
+<w:hdr xmlns:m="http://schemas.openxmlformats.org/officeDocument/2006/math" xmlns:mc="http://schemas.openxmlformats.org/markup-compatibility/2006" xmlns:mo="http://schemas.microsoft.com/office/mac/office/2008/main" xmlns:mv="urn:schemas-microsoft-com:mac:vml" xmlns:o="urn:schemas-microsoft-com:office:office" xmlns:r="http://schemas.openxmlformats.org/officeDocument/2006/relationships" xmlns:v="urn:schemas-microsoft-com:vml" xmlns:w10="urn:schemas-microsoft-com:office:word" xmlns:w14="http://schemas.microsoft.com/office/word/2010/wordml" xmlns:w="http://schemas.openxmlformats.org/wordprocessingml/2006/main" xmlns:wne="http://schemas.microsoft.com/office/word/2006/wordml" xmlns:wp14="http://schemas.microsoft.com/office/word/2010/wordprocessingDrawing" xmlns:wp="http://schemas.openxmlformats.org/drawingml/2006/wordprocessingDrawing" xmlns:wpc="http://schemas.microsoft.com/office/word/2010/wordprocessingCanvas" xmlns:wpg="http://schemas.microsoft.com/office/word/2010/wordprocessingGroup" xmlns:wpi="http://schemas.microsoft.com/office/word/2010/wordprocessingInk" xmlns:wps="http://schemas.microsoft.com/office/word/2010/wordprocessingShape" mc:Ignorable="w14 wp14">
+  <w:p>
+    <w:pPr>
+      <w:pStyle w:val="Caption"/>
+    </w:pPr>
+    <w:r>
+      <w:rPr>
+        <w:color w:val="595959"/>
+        <w:sz w:val="15"/>
+      </w:rPr>
+      <w:t>JUST PEACHY  |  AUTOMATED SPEECH EVALUATION  |  CPU + CUDA OPERATIONS</w:t>
+    </w:r>
+  </w:p>
+</w:hdr>
 </file>
 
 <file path=word/numbering.xml><?xml version="1.0" encoding="utf-8"?>
@@ -1178,12 +1307,11 @@
     <w:qFormat/>
     <w:rsid w:val="00FC693F"/>
     <w:pPr>
-      <w:spacing w:after="100" w:line="259" w:lineRule="auto"/>
+      <w:spacing w:after="40" w:line="240" w:lineRule="auto"/>
     </w:pPr>
     <w:rPr>
       <w:rFonts w:ascii="Aptos" w:hAnsi="Aptos"/>
-      <w:color w:val="1F2937"/>
-      <w:sz w:val="21"/>
+      <w:sz w:val="18"/>
     </w:rPr>
   </w:style>
   <w:style w:type="paragraph" w:styleId="Header">
@@ -1241,15 +1369,15 @@
     <w:pPr>
       <w:keepNext/>
       <w:keepLines/>
-      <w:spacing w:before="200" w:after="80"/>
+      <w:spacing w:before="100" w:after="40"/>
       <w:outlineLvl w:val="0"/>
     </w:pPr>
     <w:rPr>
       <w:rFonts w:asciiTheme="majorHAnsi" w:eastAsiaTheme="majorEastAsia" w:hAnsiTheme="majorHAnsi" w:cstheme="majorBidi" w:ascii="Aptos Display" w:hAnsi="Aptos Display"/>
       <w:b/>
       <w:bCs/>
-      <w:color w:val="1F4E79"/>
-      <w:sz w:val="30"/>
+      <w:color w:val="17365D"/>
+      <w:sz w:val="29"/>
       <w:szCs w:val="28"/>
     </w:rPr>
   </w:style>
@@ -1265,15 +1393,15 @@
     <w:pPr>
       <w:keepNext/>
       <w:keepLines/>
-      <w:spacing w:before="140" w:after="80"/>
+      <w:spacing w:before="100" w:after="40"/>
       <w:outlineLvl w:val="1"/>
     </w:pPr>
     <w:rPr>
       <w:rFonts w:asciiTheme="majorHAnsi" w:eastAsiaTheme="majorEastAsia" w:hAnsiTheme="majorHAnsi" w:cstheme="majorBidi" w:ascii="Aptos Display" w:hAnsi="Aptos Display"/>
       <w:b/>
       <w:bCs/>
-      <w:color w:val="1F4E79"/>
-      <w:sz w:val="25"/>
+      <w:color w:val="2F5597"/>
+      <w:sz w:val="23"/>
       <w:szCs w:val="26"/>
     </w:rPr>
   </w:style>
@@ -1289,15 +1417,15 @@
     <w:pPr>
       <w:keepNext/>
       <w:keepLines/>
-      <w:spacing w:before="140" w:after="80"/>
+      <w:spacing w:before="100" w:after="40"/>
       <w:outlineLvl w:val="2"/>
     </w:pPr>
     <w:rPr>
       <w:rFonts w:asciiTheme="majorHAnsi" w:eastAsiaTheme="majorEastAsia" w:hAnsiTheme="majorHAnsi" w:cstheme="majorBidi" w:ascii="Aptos Display" w:hAnsi="Aptos Display"/>
       <w:b/>
       <w:bCs/>
-      <w:color w:val="1F4E79"/>
-      <w:sz w:val="22"/>
+      <w:color w:val="365F91"/>
+      <w:sz w:val="20"/>
     </w:rPr>
   </w:style>
   <w:style w:type="paragraph" w:styleId="Heading4">
@@ -1528,19 +1656,20 @@
     <w:qFormat/>
     <w:rsid w:val="00FC693F"/>
     <w:pPr>
+      <w:keepNext/>
       <w:pBdr>
         <w:bottom w:val="single" w:sz="8" w:space="4" w:color="4F81BD" w:themeColor="accent1"/>
       </w:pBdr>
-      <w:spacing w:after="240" w:line="240" w:lineRule="auto"/>
+      <w:spacing w:after="40" w:line="240" w:lineRule="auto" w:before="100"/>
       <w:contextualSpacing/>
     </w:pPr>
     <w:rPr>
       <w:rFonts w:asciiTheme="majorHAnsi" w:eastAsiaTheme="majorEastAsia" w:hAnsiTheme="majorHAnsi" w:cstheme="majorBidi" w:ascii="Aptos Display" w:hAnsi="Aptos Display"/>
       <w:b/>
-      <w:color w:val="1F4E79"/>
+      <w:color w:val="17365D"/>
       <w:spacing w:val="5"/>
       <w:kern w:val="28"/>
-      <w:sz w:val="44"/>
+      <w:sz w:val="42"/>
       <w:szCs w:val="52"/>
     </w:rPr>
   </w:style>
@@ -12869,18 +12998,6 @@
         <w:shd w:val="clear" w:color="auto" w:fill="FBCAA2" w:themeFill="accent6" w:themeFillTint="7F"/>
       </w:tcPr>
     </w:tblStylePr>
-  </w:style>
-  <w:style w:type="paragraph" w:customStyle="1" w:styleId="CodeBlock">
-    <w:name w:val="Code Block"/>
-    <w:pPr>
-      <w:spacing w:before="60" w:after="120" w:line="240" w:lineRule="auto"/>
-      <w:ind w:left="173" w:right="173"/>
-    </w:pPr>
-    <w:rPr>
-      <w:rFonts w:ascii="Consolas" w:hAnsi="Consolas"/>
-      <w:color w:val="1F2937"/>
-      <w:sz w:val="17"/>
-    </w:rPr>
   </w:style>
 </w:styles>
 </file>

</xml_diff>